<commit_message>
Day 6 - UX improvement on Zeki side. Notes added for presentations, and to README
</commit_message>
<xml_diff>
--- a/demo/zeki-demo-notes.docx
+++ b/demo/zeki-demo-notes.docx
@@ -1159,6 +1159,27 @@
       </w:r>
       <w:r>
         <w:t xml:space="preserve"> VCNL4040 (SEN-15177, $4.95) instead of the VL53L1X. A 4 m sensor with a ~40 mm blind zone is right for a doorway, wrong for a cup. VCNL4040: 0 to 20 cm, zero dead zone, $25 cheaper.</w:t>
+      </w:r>
+    </w:p>
+    <w:p>
+      <w:pPr>
+        <w:pStyle w:val="ListParagraph"/>
+        <w:keepNext w:val="false"/>
+        <w:numPr>
+          <w:ilvl w:val="0"/>
+          <w:numId w:val="2"/>
+        </w:numPr>
+        <w:spacing w:after="40"/>
+      </w:pPr>
+      <w:r>
+        <w:rPr>
+          <w:b/>
+          <w:bCs/>
+        </w:rPr>
+        <w:t xml:space="preserve">Caveat:</w:t>
+      </w:r>
+      <w:r>
+        <w:t xml:space="preserve"> the VCNL4040 reads reflected brightness, the same way soap dispensers that failed on darker skin work. I'd calibrate to each cup and test with a range of hands before shipping it.</w:t>
       </w:r>
     </w:p>
     <w:p>

</xml_diff>